<commit_message>
organising files to make it easy to find what you are looking for
</commit_message>
<xml_diff>
--- a/tables/SupplementalTable02.docx
+++ b/tables/SupplementalTable02.docx
@@ -1,22 +1,30 @@
 
 <file path=word/document.xml><?xml version="1.0" encoding="utf-8"?>
-<w:document xmlns:wpc="http://schemas.microsoft.com/office/word/2010/wordprocessingCanvas" xmlns:cx="http://schemas.microsoft.com/office/drawing/2014/chartex" xmlns:cx1="http://schemas.microsoft.com/office/drawing/2015/9/8/chartex" xmlns:cx2="http://schemas.microsoft.com/office/drawing/2015/10/21/chartex" xmlns:cx3="http://schemas.microsoft.com/office/drawing/2016/5/9/chartex" xmlns:cx4="http://schemas.microsoft.com/office/drawing/2016/5/10/chartex" xmlns:cx5="http://schemas.microsoft.com/office/drawing/2016/5/11/chartex" xmlns:cx6="http://schemas.microsoft.com/office/drawing/2016/5/12/chartex" xmlns:cx7="http://schemas.microsoft.com/office/drawing/2016/5/13/chartex" xmlns:cx8="http://schemas.microsoft.com/office/drawing/2016/5/14/chartex" xmlns:mc="http://schemas.openxmlformats.org/markup-compatibility/2006" xmlns:aink="http://schemas.microsoft.com/office/drawing/2016/ink" xmlns:am3d="http://schemas.microsoft.com/office/drawing/2017/model3d" xmlns:o="urn:schemas-microsoft-com:office:office" xmlns:oel="http://schemas.microsoft.com/office/2019/extlst" xmlns:r="http://schemas.openxmlformats.org/officeDocument/2006/relationships" xmlns:m="http://schemas.openxmlformats.org/officeDocument/2006/math" xmlns:v="urn:schemas-microsoft-com:vml" xmlns:wp14="http://schemas.microsoft.com/office/word/2010/wordprocessingDrawing" xmlns:wp="http://schemas.openxmlformats.org/drawingml/2006/wordprocessingDrawing" xmlns:w10="urn:schemas-microsoft-com:office:word" xmlns:w="http://schemas.openxmlformats.org/wordprocessingml/2006/main" xmlns:w14="http://schemas.microsoft.com/office/word/2010/wordml" xmlns:w15="http://schemas.microsoft.com/office/word/2012/wordml" xmlns:w16cex="http://schemas.microsoft.com/office/word/2018/wordml/cex" xmlns:w16cid="http://schemas.microsoft.com/office/word/2016/wordml/cid" xmlns:w16="http://schemas.microsoft.com/office/word/2018/wordml" xmlns:w16sdtdh="http://schemas.microsoft.com/office/word/2020/wordml/sdtdatahash" xmlns:w16se="http://schemas.microsoft.com/office/word/2015/wordml/symex" xmlns:wpg="http://schemas.microsoft.com/office/word/2010/wordprocessingGroup" xmlns:wpi="http://schemas.microsoft.com/office/word/2010/wordprocessingInk" xmlns:wne="http://schemas.microsoft.com/office/word/2006/wordml" xmlns:wps="http://schemas.microsoft.com/office/word/2010/wordprocessingShape" mc:Ignorable="w14 w15 w16se w16cid w16 w16cex w16sdtdh wp14">
+<w:document xmlns:wpc="http://schemas.microsoft.com/office/word/2010/wordprocessingCanvas" xmlns:cx="http://schemas.microsoft.com/office/drawing/2014/chartex" xmlns:cx1="http://schemas.microsoft.com/office/drawing/2015/9/8/chartex" xmlns:cx2="http://schemas.microsoft.com/office/drawing/2015/10/21/chartex" xmlns:cx3="http://schemas.microsoft.com/office/drawing/2016/5/9/chartex" xmlns:cx4="http://schemas.microsoft.com/office/drawing/2016/5/10/chartex" xmlns:cx5="http://schemas.microsoft.com/office/drawing/2016/5/11/chartex" xmlns:cx6="http://schemas.microsoft.com/office/drawing/2016/5/12/chartex" xmlns:cx7="http://schemas.microsoft.com/office/drawing/2016/5/13/chartex" xmlns:cx8="http://schemas.microsoft.com/office/drawing/2016/5/14/chartex" xmlns:mc="http://schemas.openxmlformats.org/markup-compatibility/2006" xmlns:aink="http://schemas.microsoft.com/office/drawing/2016/ink" xmlns:am3d="http://schemas.microsoft.com/office/drawing/2017/model3d" xmlns:o="urn:schemas-microsoft-com:office:office" xmlns:oel="http://schemas.microsoft.com/office/2019/extlst" xmlns:r="http://schemas.openxmlformats.org/officeDocument/2006/relationships" xmlns:m="http://schemas.openxmlformats.org/officeDocument/2006/math" xmlns:v="urn:schemas-microsoft-com:vml" xmlns:wp14="http://schemas.microsoft.com/office/word/2010/wordprocessingDrawing" xmlns:wp="http://schemas.openxmlformats.org/drawingml/2006/wordprocessingDrawing" xmlns:w10="urn:schemas-microsoft-com:office:word" xmlns:w="http://schemas.openxmlformats.org/wordprocessingml/2006/main" xmlns:w14="http://schemas.microsoft.com/office/word/2010/wordml" xmlns:w15="http://schemas.microsoft.com/office/word/2012/wordml" xmlns:w16cex="http://schemas.microsoft.com/office/word/2018/wordml/cex" xmlns:w16cid="http://schemas.microsoft.com/office/word/2016/wordml/cid" xmlns:w16="http://schemas.microsoft.com/office/word/2018/wordml" xmlns:w16du="http://schemas.microsoft.com/office/word/2023/wordml/word16du" xmlns:w16sdtdh="http://schemas.microsoft.com/office/word/2020/wordml/sdtdatahash" xmlns:w16sdtfl="http://schemas.microsoft.com/office/word/2024/wordml/sdtformatlock" xmlns:w16se="http://schemas.microsoft.com/office/word/2015/wordml/symex" xmlns:wpg="http://schemas.microsoft.com/office/word/2010/wordprocessingGroup" xmlns:wpi="http://schemas.microsoft.com/office/word/2010/wordprocessingInk" xmlns:wne="http://schemas.microsoft.com/office/word/2006/wordml" xmlns:wps="http://schemas.microsoft.com/office/word/2010/wordprocessingShape" mc:Ignorable="w14 w15 w16se w16cid w16 w16cex w16sdtdh w16sdtfl w16du wp14">
   <w:body>
     <w:tbl>
       <w:tblPr>
         <w:tblStyle w:val="TableGrid"/>
         <w:tblW w:w="16505" w:type="dxa"/>
         <w:tblInd w:w="-1279" w:type="dxa"/>
+        <w:tblBorders>
+          <w:top w:val="none" w:sz="0" w:space="0" w:color="auto"/>
+          <w:left w:val="none" w:sz="0" w:space="0" w:color="auto"/>
+          <w:bottom w:val="none" w:sz="0" w:space="0" w:color="auto"/>
+          <w:right w:val="none" w:sz="0" w:space="0" w:color="auto"/>
+          <w:insideH w:val="none" w:sz="0" w:space="0" w:color="auto"/>
+          <w:insideV w:val="none" w:sz="0" w:space="0" w:color="auto"/>
+        </w:tblBorders>
         <w:tblLook w:val="04A0" w:firstRow="1" w:lastRow="0" w:firstColumn="1" w:lastColumn="0" w:noHBand="0" w:noVBand="1"/>
       </w:tblPr>
       <w:tblGrid>
-        <w:gridCol w:w="2461"/>
-        <w:gridCol w:w="3775"/>
-        <w:gridCol w:w="2126"/>
-        <w:gridCol w:w="1843"/>
-        <w:gridCol w:w="1842"/>
-        <w:gridCol w:w="2424"/>
-        <w:gridCol w:w="2034"/>
+        <w:gridCol w:w="2442"/>
+        <w:gridCol w:w="3754"/>
+        <w:gridCol w:w="2112"/>
+        <w:gridCol w:w="1947"/>
+        <w:gridCol w:w="1830"/>
+        <w:gridCol w:w="2401"/>
+        <w:gridCol w:w="2019"/>
       </w:tblGrid>
       <w:tr>
         <w:trPr>
@@ -26,12 +34,31 @@
           <w:tcPr>
             <w:tcW w:w="10205" w:type="dxa"/>
             <w:gridSpan w:val="4"/>
+            <w:tcBorders>
+              <w:top w:val="single" w:sz="18" w:space="0" w:color="auto"/>
+              <w:bottom w:val="single" w:sz="8" w:space="0" w:color="auto"/>
+              <w:right w:val="single" w:sz="4" w:space="0" w:color="auto"/>
+            </w:tcBorders>
           </w:tcPr>
           <w:p>
             <w:pPr>
               <w:jc w:val="center"/>
-            </w:pPr>
-            <w:r>
+              <w:rPr>
+                <w:rFonts w:ascii="Aptos" w:hAnsi="Aptos"/>
+                <w:b/>
+                <w:bCs/>
+                <w:sz w:val="24"/>
+                <w:szCs w:val="24"/>
+              </w:rPr>
+            </w:pPr>
+            <w:r>
+              <w:rPr>
+                <w:rFonts w:ascii="Aptos" w:hAnsi="Aptos"/>
+                <w:b/>
+                <w:bCs/>
+                <w:sz w:val="24"/>
+                <w:szCs w:val="24"/>
+              </w:rPr>
               <w:t>Model</w:t>
             </w:r>
           </w:p>
@@ -40,12 +67,31 @@
           <w:tcPr>
             <w:tcW w:w="6300" w:type="dxa"/>
             <w:gridSpan w:val="3"/>
+            <w:tcBorders>
+              <w:top w:val="single" w:sz="18" w:space="0" w:color="auto"/>
+              <w:left w:val="single" w:sz="4" w:space="0" w:color="auto"/>
+              <w:bottom w:val="single" w:sz="8" w:space="0" w:color="auto"/>
+            </w:tcBorders>
           </w:tcPr>
           <w:p>
             <w:pPr>
               <w:jc w:val="center"/>
-            </w:pPr>
-            <w:r>
+              <w:rPr>
+                <w:rFonts w:ascii="Aptos" w:hAnsi="Aptos"/>
+                <w:b/>
+                <w:bCs/>
+                <w:sz w:val="24"/>
+                <w:szCs w:val="24"/>
+              </w:rPr>
+            </w:pPr>
+            <w:r>
+              <w:rPr>
+                <w:rFonts w:ascii="Aptos" w:hAnsi="Aptos"/>
+                <w:b/>
+                <w:bCs/>
+                <w:sz w:val="24"/>
+                <w:szCs w:val="24"/>
+              </w:rPr>
               <w:t>Priors</w:t>
             </w:r>
           </w:p>
@@ -58,27 +104,55 @@
         <w:tc>
           <w:tcPr>
             <w:tcW w:w="2461" w:type="dxa"/>
-          </w:tcPr>
-          <w:p>
-            <w:r>
+            <w:tcBorders>
+              <w:top w:val="single" w:sz="8" w:space="0" w:color="auto"/>
+              <w:bottom w:val="single" w:sz="8" w:space="0" w:color="auto"/>
+            </w:tcBorders>
+            <w:shd w:val="clear" w:color="auto" w:fill="A6A6A6" w:themeFill="background1" w:themeFillShade="A6"/>
+          </w:tcPr>
+          <w:p>
+            <w:pPr>
+              <w:rPr>
+                <w:rFonts w:ascii="Aptos" w:hAnsi="Aptos"/>
+              </w:rPr>
+            </w:pPr>
+            <w:r>
+              <w:rPr>
+                <w:rFonts w:ascii="Aptos" w:hAnsi="Aptos"/>
+              </w:rPr>
               <w:t>Response variable</w:t>
             </w:r>
             <w:r>
+              <w:rPr>
+                <w:rFonts w:ascii="Aptos" w:hAnsi="Aptos"/>
+              </w:rPr>
               <w:t xml:space="preserve"> </w:t>
             </w:r>
           </w:p>
           <w:p>
-            <w:r>
+            <w:pPr>
+              <w:rPr>
+                <w:rFonts w:ascii="Aptos" w:hAnsi="Aptos"/>
+              </w:rPr>
+            </w:pPr>
+            <w:r>
+              <w:rPr>
+                <w:rFonts w:ascii="Aptos" w:hAnsi="Aptos"/>
+              </w:rPr>
               <w:t xml:space="preserve">(model type; </w:t>
             </w:r>
             <w:r>
               <w:rPr>
+                <w:rFonts w:ascii="Aptos" w:hAnsi="Aptos"/>
                 <w:i/>
                 <w:iCs/>
               </w:rPr>
               <w:t>R package</w:t>
             </w:r>
             <w:r>
+              <w:rPr>
+                <w:rFonts w:ascii="Aptos" w:hAnsi="Aptos"/>
+              </w:rPr>
               <w:t>)</w:t>
             </w:r>
           </w:p>
@@ -86,31 +160,50 @@
         <w:tc>
           <w:tcPr>
             <w:tcW w:w="3775" w:type="dxa"/>
-          </w:tcPr>
-          <w:p>
-            <w:r>
+            <w:tcBorders>
+              <w:top w:val="single" w:sz="8" w:space="0" w:color="auto"/>
+              <w:bottom w:val="single" w:sz="8" w:space="0" w:color="auto"/>
+            </w:tcBorders>
+            <w:shd w:val="clear" w:color="auto" w:fill="A6A6A6" w:themeFill="background1" w:themeFillShade="A6"/>
+          </w:tcPr>
+          <w:p>
+            <w:pPr>
+              <w:rPr>
+                <w:rFonts w:ascii="Aptos" w:hAnsi="Aptos"/>
+              </w:rPr>
+            </w:pPr>
+            <w:r>
+              <w:rPr>
+                <w:rFonts w:ascii="Aptos" w:hAnsi="Aptos"/>
+              </w:rPr>
               <w:t xml:space="preserve">Covariates (fixed, </w:t>
             </w:r>
             <w:r>
               <w:rPr>
+                <w:rFonts w:ascii="Aptos" w:hAnsi="Aptos"/>
                 <w:i/>
                 <w:iCs/>
               </w:rPr>
               <w:t>b</w:t>
             </w:r>
             <w:r>
+              <w:rPr>
+                <w:rFonts w:ascii="Aptos" w:hAnsi="Aptos"/>
+              </w:rPr>
               <w:t xml:space="preserve">) </w:t>
             </w:r>
           </w:p>
           <w:p>
             <w:pPr>
               <w:rPr>
+                <w:rFonts w:ascii="Aptos" w:hAnsi="Aptos"/>
                 <w:sz w:val="16"/>
                 <w:szCs w:val="16"/>
               </w:rPr>
             </w:pPr>
             <w:r>
               <w:rPr>
+                <w:rFonts w:ascii="Aptos" w:hAnsi="Aptos"/>
                 <w:sz w:val="16"/>
                 <w:szCs w:val="16"/>
               </w:rPr>
@@ -121,9 +214,22 @@
         <w:tc>
           <w:tcPr>
             <w:tcW w:w="2126" w:type="dxa"/>
-          </w:tcPr>
-          <w:p>
-            <w:r>
+            <w:tcBorders>
+              <w:top w:val="single" w:sz="8" w:space="0" w:color="auto"/>
+              <w:bottom w:val="single" w:sz="8" w:space="0" w:color="auto"/>
+            </w:tcBorders>
+            <w:shd w:val="clear" w:color="auto" w:fill="A6A6A6" w:themeFill="background1" w:themeFillShade="A6"/>
+          </w:tcPr>
+          <w:p>
+            <w:pPr>
+              <w:rPr>
+                <w:rFonts w:ascii="Aptos" w:hAnsi="Aptos"/>
+              </w:rPr>
+            </w:pPr>
+            <w:r>
+              <w:rPr>
+                <w:rFonts w:ascii="Aptos" w:hAnsi="Aptos"/>
+              </w:rPr>
               <w:t>Covariates (random)</w:t>
             </w:r>
           </w:p>
@@ -131,9 +237,23 @@
         <w:tc>
           <w:tcPr>
             <w:tcW w:w="1843" w:type="dxa"/>
-          </w:tcPr>
-          <w:p>
-            <w:r>
+            <w:tcBorders>
+              <w:top w:val="single" w:sz="8" w:space="0" w:color="auto"/>
+              <w:bottom w:val="single" w:sz="8" w:space="0" w:color="auto"/>
+              <w:right w:val="single" w:sz="4" w:space="0" w:color="auto"/>
+            </w:tcBorders>
+            <w:shd w:val="clear" w:color="auto" w:fill="A6A6A6" w:themeFill="background1" w:themeFillShade="A6"/>
+          </w:tcPr>
+          <w:p>
+            <w:pPr>
+              <w:rPr>
+                <w:rFonts w:ascii="Aptos" w:hAnsi="Aptos"/>
+              </w:rPr>
+            </w:pPr>
+            <w:r>
+              <w:rPr>
+                <w:rFonts w:ascii="Aptos" w:hAnsi="Aptos"/>
+              </w:rPr>
               <w:t>Distribution (link)</w:t>
             </w:r>
           </w:p>
@@ -141,9 +261,23 @@
         <w:tc>
           <w:tcPr>
             <w:tcW w:w="1842" w:type="dxa"/>
-          </w:tcPr>
-          <w:p>
-            <w:r>
+            <w:tcBorders>
+              <w:top w:val="single" w:sz="8" w:space="0" w:color="auto"/>
+              <w:left w:val="single" w:sz="4" w:space="0" w:color="auto"/>
+              <w:bottom w:val="single" w:sz="8" w:space="0" w:color="auto"/>
+            </w:tcBorders>
+            <w:shd w:val="clear" w:color="auto" w:fill="A6A6A6" w:themeFill="background1" w:themeFillShade="A6"/>
+          </w:tcPr>
+          <w:p>
+            <w:pPr>
+              <w:rPr>
+                <w:rFonts w:ascii="Aptos" w:hAnsi="Aptos"/>
+              </w:rPr>
+            </w:pPr>
+            <w:r>
+              <w:rPr>
+                <w:rFonts w:ascii="Aptos" w:hAnsi="Aptos"/>
+              </w:rPr>
               <w:t>Intercept</w:t>
             </w:r>
           </w:p>
@@ -151,9 +285,22 @@
         <w:tc>
           <w:tcPr>
             <w:tcW w:w="2424" w:type="dxa"/>
-          </w:tcPr>
-          <w:p>
-            <w:r>
+            <w:tcBorders>
+              <w:top w:val="single" w:sz="8" w:space="0" w:color="auto"/>
+              <w:bottom w:val="single" w:sz="8" w:space="0" w:color="auto"/>
+            </w:tcBorders>
+            <w:shd w:val="clear" w:color="auto" w:fill="A6A6A6" w:themeFill="background1" w:themeFillShade="A6"/>
+          </w:tcPr>
+          <w:p>
+            <w:pPr>
+              <w:rPr>
+                <w:rFonts w:ascii="Aptos" w:hAnsi="Aptos"/>
+              </w:rPr>
+            </w:pPr>
+            <w:r>
+              <w:rPr>
+                <w:rFonts w:ascii="Aptos" w:hAnsi="Aptos"/>
+              </w:rPr>
               <w:t>Slope</w:t>
             </w:r>
           </w:p>
@@ -161,9 +308,22 @@
         <w:tc>
           <w:tcPr>
             <w:tcW w:w="2034" w:type="dxa"/>
-          </w:tcPr>
-          <w:p>
-            <w:r>
+            <w:tcBorders>
+              <w:top w:val="single" w:sz="8" w:space="0" w:color="auto"/>
+              <w:bottom w:val="single" w:sz="8" w:space="0" w:color="auto"/>
+            </w:tcBorders>
+            <w:shd w:val="clear" w:color="auto" w:fill="A6A6A6" w:themeFill="background1" w:themeFillShade="A6"/>
+          </w:tcPr>
+          <w:p>
+            <w:pPr>
+              <w:rPr>
+                <w:rFonts w:ascii="Aptos" w:hAnsi="Aptos"/>
+              </w:rPr>
+            </w:pPr>
+            <w:r>
+              <w:rPr>
+                <w:rFonts w:ascii="Aptos" w:hAnsi="Aptos"/>
+              </w:rPr>
               <w:t xml:space="preserve">Residual standard deviation </w:t>
             </w:r>
           </w:p>
@@ -176,24 +336,47 @@
         <w:tc>
           <w:tcPr>
             <w:tcW w:w="2461" w:type="dxa"/>
-          </w:tcPr>
-          <w:p>
-            <w:r>
+            <w:tcBorders>
+              <w:top w:val="single" w:sz="8" w:space="0" w:color="auto"/>
+            </w:tcBorders>
+          </w:tcPr>
+          <w:p>
+            <w:pPr>
+              <w:rPr>
+                <w:rFonts w:ascii="Aptos" w:hAnsi="Aptos"/>
+              </w:rPr>
+            </w:pPr>
+            <w:r>
+              <w:rPr>
+                <w:rFonts w:ascii="Aptos" w:hAnsi="Aptos"/>
+              </w:rPr>
               <w:t>Standard length</w:t>
             </w:r>
           </w:p>
           <w:p>
-            <w:r>
+            <w:pPr>
+              <w:rPr>
+                <w:rFonts w:ascii="Aptos" w:hAnsi="Aptos"/>
+              </w:rPr>
+            </w:pPr>
+            <w:r>
+              <w:rPr>
+                <w:rFonts w:ascii="Aptos" w:hAnsi="Aptos"/>
+              </w:rPr>
               <w:t xml:space="preserve">(GLMM; </w:t>
             </w:r>
             <w:r>
               <w:rPr>
+                <w:rFonts w:ascii="Aptos" w:hAnsi="Aptos"/>
                 <w:i/>
                 <w:iCs/>
               </w:rPr>
               <w:t>brms</w:t>
             </w:r>
             <w:r>
+              <w:rPr>
+                <w:rFonts w:ascii="Aptos" w:hAnsi="Aptos"/>
+              </w:rPr>
               <w:t>)</w:t>
             </w:r>
           </w:p>
@@ -201,24 +384,59 @@
         <w:tc>
           <w:tcPr>
             <w:tcW w:w="3775" w:type="dxa"/>
-          </w:tcPr>
-          <w:p>
-            <w:r>
+            <w:tcBorders>
+              <w:top w:val="single" w:sz="8" w:space="0" w:color="auto"/>
+            </w:tcBorders>
+          </w:tcPr>
+          <w:p>
+            <w:pPr>
+              <w:rPr>
+                <w:rFonts w:ascii="Aptos" w:hAnsi="Aptos"/>
+              </w:rPr>
+            </w:pPr>
+            <w:r>
+              <w:rPr>
+                <w:rFonts w:ascii="Aptos" w:hAnsi="Aptos"/>
+              </w:rPr>
               <w:t>Developmental temperature*Latitude</w:t>
             </w:r>
           </w:p>
           <w:p>
-            <w:r>
+            <w:pPr>
+              <w:rPr>
+                <w:rFonts w:ascii="Aptos" w:hAnsi="Aptos"/>
+              </w:rPr>
+            </w:pPr>
+            <w:r>
+              <w:rPr>
+                <w:rFonts w:ascii="Aptos" w:hAnsi="Aptos"/>
+              </w:rPr>
               <w:t xml:space="preserve">Female standard length </w:t>
             </w:r>
           </w:p>
           <w:p>
-            <w:r>
+            <w:pPr>
+              <w:rPr>
+                <w:rFonts w:ascii="Aptos" w:hAnsi="Aptos"/>
+              </w:rPr>
+            </w:pPr>
+            <w:r>
+              <w:rPr>
+                <w:rFonts w:ascii="Aptos" w:hAnsi="Aptos"/>
+              </w:rPr>
               <w:t xml:space="preserve">Density </w:t>
             </w:r>
           </w:p>
           <w:p>
-            <w:r>
+            <w:pPr>
+              <w:rPr>
+                <w:rFonts w:ascii="Aptos" w:hAnsi="Aptos"/>
+              </w:rPr>
+            </w:pPr>
+            <w:r>
+              <w:rPr>
+                <w:rFonts w:ascii="Aptos" w:hAnsi="Aptos"/>
+              </w:rPr>
               <w:t xml:space="preserve">Age </w:t>
             </w:r>
           </w:p>
@@ -226,24 +444,59 @@
         <w:tc>
           <w:tcPr>
             <w:tcW w:w="2126" w:type="dxa"/>
-          </w:tcPr>
-          <w:p>
-            <w:r>
+            <w:tcBorders>
+              <w:top w:val="single" w:sz="8" w:space="0" w:color="auto"/>
+            </w:tcBorders>
+          </w:tcPr>
+          <w:p>
+            <w:pPr>
+              <w:rPr>
+                <w:rFonts w:ascii="Aptos" w:hAnsi="Aptos"/>
+              </w:rPr>
+            </w:pPr>
+            <w:r>
+              <w:rPr>
+                <w:rFonts w:ascii="Aptos" w:hAnsi="Aptos"/>
+              </w:rPr>
               <w:t xml:space="preserve">Level/Tank </w:t>
             </w:r>
           </w:p>
           <w:p>
-            <w:r>
+            <w:pPr>
+              <w:rPr>
+                <w:rFonts w:ascii="Aptos" w:hAnsi="Aptos"/>
+              </w:rPr>
+            </w:pPr>
+            <w:r>
+              <w:rPr>
+                <w:rFonts w:ascii="Aptos" w:hAnsi="Aptos"/>
+              </w:rPr>
               <w:t xml:space="preserve">Population </w:t>
             </w:r>
           </w:p>
           <w:p>
-            <w:r>
+            <w:pPr>
+              <w:rPr>
+                <w:rFonts w:ascii="Aptos" w:hAnsi="Aptos"/>
+              </w:rPr>
+            </w:pPr>
+            <w:r>
+              <w:rPr>
+                <w:rFonts w:ascii="Aptos" w:hAnsi="Aptos"/>
+              </w:rPr>
               <w:t xml:space="preserve">Female </w:t>
             </w:r>
           </w:p>
           <w:p>
-            <w:r>
+            <w:pPr>
+              <w:rPr>
+                <w:rFonts w:ascii="Aptos" w:hAnsi="Aptos"/>
+              </w:rPr>
+            </w:pPr>
+            <w:r>
+              <w:rPr>
+                <w:rFonts w:ascii="Aptos" w:hAnsi="Aptos"/>
+              </w:rPr>
               <w:t>Clutch order</w:t>
             </w:r>
           </w:p>
@@ -251,9 +504,21 @@
         <w:tc>
           <w:tcPr>
             <w:tcW w:w="1843" w:type="dxa"/>
-          </w:tcPr>
-          <w:p>
-            <w:r>
+            <w:tcBorders>
+              <w:top w:val="single" w:sz="8" w:space="0" w:color="auto"/>
+              <w:right w:val="single" w:sz="4" w:space="0" w:color="auto"/>
+            </w:tcBorders>
+          </w:tcPr>
+          <w:p>
+            <w:pPr>
+              <w:rPr>
+                <w:rFonts w:ascii="Aptos" w:hAnsi="Aptos"/>
+              </w:rPr>
+            </w:pPr>
+            <w:r>
+              <w:rPr>
+                <w:rFonts w:ascii="Aptos" w:hAnsi="Aptos"/>
+              </w:rPr>
               <w:t>Gaussian(identity)</w:t>
             </w:r>
           </w:p>
@@ -261,9 +526,21 @@
         <w:tc>
           <w:tcPr>
             <w:tcW w:w="1842" w:type="dxa"/>
-          </w:tcPr>
-          <w:p>
-            <w:r>
+            <w:tcBorders>
+              <w:top w:val="single" w:sz="8" w:space="0" w:color="auto"/>
+              <w:left w:val="single" w:sz="4" w:space="0" w:color="auto"/>
+            </w:tcBorders>
+          </w:tcPr>
+          <w:p>
+            <w:pPr>
+              <w:rPr>
+                <w:rFonts w:ascii="Aptos" w:hAnsi="Aptos"/>
+              </w:rPr>
+            </w:pPr>
+            <w:r>
+              <w:rPr>
+                <w:rFonts w:ascii="Aptos" w:hAnsi="Aptos"/>
+              </w:rPr>
               <w:t>Normal (31.5, 1.5)</w:t>
             </w:r>
           </w:p>
@@ -271,9 +548,20 @@
         <w:tc>
           <w:tcPr>
             <w:tcW w:w="2424" w:type="dxa"/>
-          </w:tcPr>
-          <w:p>
-            <w:r>
+            <w:tcBorders>
+              <w:top w:val="single" w:sz="8" w:space="0" w:color="auto"/>
+            </w:tcBorders>
+          </w:tcPr>
+          <w:p>
+            <w:pPr>
+              <w:rPr>
+                <w:rFonts w:ascii="Aptos" w:hAnsi="Aptos"/>
+              </w:rPr>
+            </w:pPr>
+            <w:r>
+              <w:rPr>
+                <w:rFonts w:ascii="Aptos" w:hAnsi="Aptos"/>
+              </w:rPr>
               <w:t>Normal (0, 1.5)</w:t>
             </w:r>
           </w:p>
@@ -281,17 +569,34 @@
         <w:tc>
           <w:tcPr>
             <w:tcW w:w="2034" w:type="dxa"/>
-          </w:tcPr>
-          <w:p>
-            <w:r>
+            <w:tcBorders>
+              <w:top w:val="single" w:sz="8" w:space="0" w:color="auto"/>
+            </w:tcBorders>
+          </w:tcPr>
+          <w:p>
+            <w:pPr>
+              <w:rPr>
+                <w:rFonts w:ascii="Aptos" w:hAnsi="Aptos"/>
+              </w:rPr>
+            </w:pPr>
+            <w:r>
+              <w:rPr>
+                <w:rFonts w:ascii="Aptos" w:hAnsi="Aptos"/>
+              </w:rPr>
               <w:t xml:space="preserve">Student </w:t>
             </w:r>
             <w:proofErr w:type="spellStart"/>
             <w:r>
+              <w:rPr>
+                <w:rFonts w:ascii="Aptos" w:hAnsi="Aptos"/>
+              </w:rPr>
               <w:t>t</w:t>
             </w:r>
             <w:proofErr w:type="spellEnd"/>
             <w:r>
+              <w:rPr>
+                <w:rFonts w:ascii="Aptos" w:hAnsi="Aptos"/>
+              </w:rPr>
               <w:t xml:space="preserve"> (3, 0, 4.4) </w:t>
             </w:r>
           </w:p>
@@ -304,27 +609,51 @@
         <w:tc>
           <w:tcPr>
             <w:tcW w:w="2461" w:type="dxa"/>
-          </w:tcPr>
-          <w:p>
-            <w:r>
+            <w:shd w:val="clear" w:color="auto" w:fill="A6A6A6" w:themeFill="background1" w:themeFillShade="A6"/>
+          </w:tcPr>
+          <w:p>
+            <w:pPr>
+              <w:rPr>
+                <w:rFonts w:ascii="Aptos" w:hAnsi="Aptos"/>
+              </w:rPr>
+            </w:pPr>
+            <w:r>
+              <w:rPr>
+                <w:rFonts w:ascii="Aptos" w:hAnsi="Aptos"/>
+              </w:rPr>
               <w:t>Mass</w:t>
             </w:r>
             <w:r>
+              <w:rPr>
+                <w:rFonts w:ascii="Aptos" w:hAnsi="Aptos"/>
+              </w:rPr>
               <w:t xml:space="preserve"> </w:t>
             </w:r>
           </w:p>
           <w:p>
-            <w:r>
+            <w:pPr>
+              <w:rPr>
+                <w:rFonts w:ascii="Aptos" w:hAnsi="Aptos"/>
+              </w:rPr>
+            </w:pPr>
+            <w:r>
+              <w:rPr>
+                <w:rFonts w:ascii="Aptos" w:hAnsi="Aptos"/>
+              </w:rPr>
               <w:t xml:space="preserve">(GLMM; </w:t>
             </w:r>
             <w:r>
               <w:rPr>
+                <w:rFonts w:ascii="Aptos" w:hAnsi="Aptos"/>
                 <w:i/>
                 <w:iCs/>
               </w:rPr>
               <w:t>brms</w:t>
             </w:r>
             <w:r>
+              <w:rPr>
+                <w:rFonts w:ascii="Aptos" w:hAnsi="Aptos"/>
+              </w:rPr>
               <w:t>)</w:t>
             </w:r>
           </w:p>
@@ -332,38 +661,83 @@
         <w:tc>
           <w:tcPr>
             <w:tcW w:w="3775" w:type="dxa"/>
-          </w:tcPr>
-          <w:p>
-            <w:r>
-              <w:t>Developmental temperature</w:t>
-            </w:r>
-            <w:r>
-              <w:t xml:space="preserve"> *Latitude </w:t>
-            </w:r>
-          </w:p>
-          <w:p>
-            <w:r>
+            <w:shd w:val="clear" w:color="auto" w:fill="A6A6A6" w:themeFill="background1" w:themeFillShade="A6"/>
+          </w:tcPr>
+          <w:p>
+            <w:pPr>
+              <w:rPr>
+                <w:rFonts w:ascii="Aptos" w:hAnsi="Aptos"/>
+              </w:rPr>
+            </w:pPr>
+            <w:r>
+              <w:rPr>
+                <w:rFonts w:ascii="Aptos" w:hAnsi="Aptos"/>
+              </w:rPr>
+              <w:t xml:space="preserve">Developmental temperature *Latitude </w:t>
+            </w:r>
+          </w:p>
+          <w:p>
+            <w:pPr>
+              <w:rPr>
+                <w:rFonts w:ascii="Aptos" w:hAnsi="Aptos"/>
+              </w:rPr>
+            </w:pPr>
+            <w:r>
+              <w:rPr>
+                <w:rFonts w:ascii="Aptos" w:hAnsi="Aptos"/>
+              </w:rPr>
               <w:t xml:space="preserve">Density </w:t>
             </w:r>
           </w:p>
-          <w:p/>
+          <w:p>
+            <w:pPr>
+              <w:rPr>
+                <w:rFonts w:ascii="Aptos" w:hAnsi="Aptos"/>
+              </w:rPr>
+            </w:pPr>
+          </w:p>
         </w:tc>
         <w:tc>
           <w:tcPr>
             <w:tcW w:w="2126" w:type="dxa"/>
-          </w:tcPr>
-          <w:p>
-            <w:r>
+            <w:shd w:val="clear" w:color="auto" w:fill="A6A6A6" w:themeFill="background1" w:themeFillShade="A6"/>
+          </w:tcPr>
+          <w:p>
+            <w:pPr>
+              <w:rPr>
+                <w:rFonts w:ascii="Aptos" w:hAnsi="Aptos"/>
+              </w:rPr>
+            </w:pPr>
+            <w:r>
+              <w:rPr>
+                <w:rFonts w:ascii="Aptos" w:hAnsi="Aptos"/>
+              </w:rPr>
               <w:t xml:space="preserve">Level/Tank </w:t>
             </w:r>
           </w:p>
           <w:p>
-            <w:r>
+            <w:pPr>
+              <w:rPr>
+                <w:rFonts w:ascii="Aptos" w:hAnsi="Aptos"/>
+              </w:rPr>
+            </w:pPr>
+            <w:r>
+              <w:rPr>
+                <w:rFonts w:ascii="Aptos" w:hAnsi="Aptos"/>
+              </w:rPr>
               <w:t xml:space="preserve">Female </w:t>
             </w:r>
           </w:p>
           <w:p>
-            <w:r>
+            <w:pPr>
+              <w:rPr>
+                <w:rFonts w:ascii="Aptos" w:hAnsi="Aptos"/>
+              </w:rPr>
+            </w:pPr>
+            <w:r>
+              <w:rPr>
+                <w:rFonts w:ascii="Aptos" w:hAnsi="Aptos"/>
+              </w:rPr>
               <w:t>Population</w:t>
             </w:r>
           </w:p>
@@ -371,9 +745,21 @@
         <w:tc>
           <w:tcPr>
             <w:tcW w:w="1843" w:type="dxa"/>
-          </w:tcPr>
-          <w:p>
-            <w:r>
+            <w:tcBorders>
+              <w:right w:val="single" w:sz="4" w:space="0" w:color="auto"/>
+            </w:tcBorders>
+            <w:shd w:val="clear" w:color="auto" w:fill="A6A6A6" w:themeFill="background1" w:themeFillShade="A6"/>
+          </w:tcPr>
+          <w:p>
+            <w:pPr>
+              <w:rPr>
+                <w:rFonts w:ascii="Aptos" w:hAnsi="Aptos"/>
+              </w:rPr>
+            </w:pPr>
+            <w:r>
+              <w:rPr>
+                <w:rFonts w:ascii="Aptos" w:hAnsi="Aptos"/>
+              </w:rPr>
               <w:t>Gamma(log)</w:t>
             </w:r>
           </w:p>
@@ -381,9 +767,21 @@
         <w:tc>
           <w:tcPr>
             <w:tcW w:w="1842" w:type="dxa"/>
-          </w:tcPr>
-          <w:p>
-            <w:r>
+            <w:tcBorders>
+              <w:left w:val="single" w:sz="4" w:space="0" w:color="auto"/>
+            </w:tcBorders>
+            <w:shd w:val="clear" w:color="auto" w:fill="A6A6A6" w:themeFill="background1" w:themeFillShade="A6"/>
+          </w:tcPr>
+          <w:p>
+            <w:pPr>
+              <w:rPr>
+                <w:rFonts w:ascii="Aptos" w:hAnsi="Aptos"/>
+              </w:rPr>
+            </w:pPr>
+            <w:r>
+              <w:rPr>
+                <w:rFonts w:ascii="Aptos" w:hAnsi="Aptos"/>
+              </w:rPr>
               <w:t>Normal (1.13, 0.20)</w:t>
             </w:r>
           </w:p>
@@ -391,9 +789,18 @@
         <w:tc>
           <w:tcPr>
             <w:tcW w:w="2424" w:type="dxa"/>
-          </w:tcPr>
-          <w:p>
-            <w:r>
+            <w:shd w:val="clear" w:color="auto" w:fill="A6A6A6" w:themeFill="background1" w:themeFillShade="A6"/>
+          </w:tcPr>
+          <w:p>
+            <w:pPr>
+              <w:rPr>
+                <w:rFonts w:ascii="Aptos" w:hAnsi="Aptos"/>
+              </w:rPr>
+            </w:pPr>
+            <w:r>
+              <w:rPr>
+                <w:rFonts w:ascii="Aptos" w:hAnsi="Aptos"/>
+              </w:rPr>
               <w:t>Normal (0, 0.25)</w:t>
             </w:r>
           </w:p>
@@ -401,9 +808,18 @@
         <w:tc>
           <w:tcPr>
             <w:tcW w:w="2034" w:type="dxa"/>
-          </w:tcPr>
-          <w:p>
-            <w:r>
+            <w:shd w:val="clear" w:color="auto" w:fill="A6A6A6" w:themeFill="background1" w:themeFillShade="A6"/>
+          </w:tcPr>
+          <w:p>
+            <w:pPr>
+              <w:rPr>
+                <w:rFonts w:ascii="Aptos" w:hAnsi="Aptos"/>
+              </w:rPr>
+            </w:pPr>
+            <w:r>
+              <w:rPr>
+                <w:rFonts w:ascii="Aptos" w:hAnsi="Aptos"/>
+              </w:rPr>
               <w:t>NA</w:t>
             </w:r>
           </w:p>
@@ -418,25 +834,48 @@
             <w:tcW w:w="2461" w:type="dxa"/>
           </w:tcPr>
           <w:p>
-            <w:r>
+            <w:pPr>
+              <w:rPr>
+                <w:rFonts w:ascii="Aptos" w:hAnsi="Aptos"/>
+              </w:rPr>
+            </w:pPr>
+            <w:r>
+              <w:rPr>
+                <w:rFonts w:ascii="Aptos" w:hAnsi="Aptos"/>
+              </w:rPr>
               <w:t>Condition</w:t>
             </w:r>
             <w:r>
+              <w:rPr>
+                <w:rFonts w:ascii="Aptos" w:hAnsi="Aptos"/>
+              </w:rPr>
               <w:t xml:space="preserve"> </w:t>
             </w:r>
           </w:p>
           <w:p>
-            <w:r>
+            <w:pPr>
+              <w:rPr>
+                <w:rFonts w:ascii="Aptos" w:hAnsi="Aptos"/>
+              </w:rPr>
+            </w:pPr>
+            <w:r>
+              <w:rPr>
+                <w:rFonts w:ascii="Aptos" w:hAnsi="Aptos"/>
+              </w:rPr>
               <w:t xml:space="preserve">(GLMM; </w:t>
             </w:r>
             <w:r>
               <w:rPr>
+                <w:rFonts w:ascii="Aptos" w:hAnsi="Aptos"/>
                 <w:i/>
                 <w:iCs/>
               </w:rPr>
               <w:t>brms</w:t>
             </w:r>
             <w:r>
+              <w:rPr>
+                <w:rFonts w:ascii="Aptos" w:hAnsi="Aptos"/>
+              </w:rPr>
               <w:t>)</w:t>
             </w:r>
           </w:p>
@@ -446,20 +885,41 @@
             <w:tcW w:w="3775" w:type="dxa"/>
           </w:tcPr>
           <w:p>
-            <w:r>
-              <w:t>Developmental temperature</w:t>
-            </w:r>
-            <w:r>
-              <w:t xml:space="preserve"> *Latitude </w:t>
-            </w:r>
-          </w:p>
-          <w:p>
-            <w:r>
+            <w:pPr>
+              <w:rPr>
+                <w:rFonts w:ascii="Aptos" w:hAnsi="Aptos"/>
+              </w:rPr>
+            </w:pPr>
+            <w:r>
+              <w:rPr>
+                <w:rFonts w:ascii="Aptos" w:hAnsi="Aptos"/>
+              </w:rPr>
+              <w:t xml:space="preserve">Developmental temperature *Latitude </w:t>
+            </w:r>
+          </w:p>
+          <w:p>
+            <w:pPr>
+              <w:rPr>
+                <w:rFonts w:ascii="Aptos" w:hAnsi="Aptos"/>
+              </w:rPr>
+            </w:pPr>
+            <w:r>
+              <w:rPr>
+                <w:rFonts w:ascii="Aptos" w:hAnsi="Aptos"/>
+              </w:rPr>
               <w:t xml:space="preserve">Density </w:t>
             </w:r>
           </w:p>
           <w:p>
-            <w:r>
+            <w:pPr>
+              <w:rPr>
+                <w:rFonts w:ascii="Aptos" w:hAnsi="Aptos"/>
+              </w:rPr>
+            </w:pPr>
+            <w:r>
+              <w:rPr>
+                <w:rFonts w:ascii="Aptos" w:hAnsi="Aptos"/>
+              </w:rPr>
               <w:t xml:space="preserve">Standard length </w:t>
             </w:r>
           </w:p>
@@ -469,17 +929,41 @@
             <w:tcW w:w="2126" w:type="dxa"/>
           </w:tcPr>
           <w:p>
-            <w:r>
+            <w:pPr>
+              <w:rPr>
+                <w:rFonts w:ascii="Aptos" w:hAnsi="Aptos"/>
+              </w:rPr>
+            </w:pPr>
+            <w:r>
+              <w:rPr>
+                <w:rFonts w:ascii="Aptos" w:hAnsi="Aptos"/>
+              </w:rPr>
               <w:t xml:space="preserve">Level/Tank </w:t>
             </w:r>
           </w:p>
           <w:p>
-            <w:r>
+            <w:pPr>
+              <w:rPr>
+                <w:rFonts w:ascii="Aptos" w:hAnsi="Aptos"/>
+              </w:rPr>
+            </w:pPr>
+            <w:r>
+              <w:rPr>
+                <w:rFonts w:ascii="Aptos" w:hAnsi="Aptos"/>
+              </w:rPr>
               <w:t xml:space="preserve">Female </w:t>
             </w:r>
           </w:p>
           <w:p>
-            <w:r>
+            <w:pPr>
+              <w:rPr>
+                <w:rFonts w:ascii="Aptos" w:hAnsi="Aptos"/>
+              </w:rPr>
+            </w:pPr>
+            <w:r>
+              <w:rPr>
+                <w:rFonts w:ascii="Aptos" w:hAnsi="Aptos"/>
+              </w:rPr>
               <w:t>Population</w:t>
             </w:r>
           </w:p>
@@ -487,9 +971,20 @@
         <w:tc>
           <w:tcPr>
             <w:tcW w:w="1843" w:type="dxa"/>
-          </w:tcPr>
-          <w:p>
-            <w:r>
+            <w:tcBorders>
+              <w:right w:val="single" w:sz="4" w:space="0" w:color="auto"/>
+            </w:tcBorders>
+          </w:tcPr>
+          <w:p>
+            <w:pPr>
+              <w:rPr>
+                <w:rFonts w:ascii="Aptos" w:hAnsi="Aptos"/>
+              </w:rPr>
+            </w:pPr>
+            <w:r>
+              <w:rPr>
+                <w:rFonts w:ascii="Aptos" w:hAnsi="Aptos"/>
+              </w:rPr>
               <w:t>Gamma(log)</w:t>
             </w:r>
           </w:p>
@@ -497,9 +992,20 @@
         <w:tc>
           <w:tcPr>
             <w:tcW w:w="1842" w:type="dxa"/>
-          </w:tcPr>
-          <w:p>
-            <w:r>
+            <w:tcBorders>
+              <w:left w:val="single" w:sz="4" w:space="0" w:color="auto"/>
+            </w:tcBorders>
+          </w:tcPr>
+          <w:p>
+            <w:pPr>
+              <w:rPr>
+                <w:rFonts w:ascii="Aptos" w:hAnsi="Aptos"/>
+              </w:rPr>
+            </w:pPr>
+            <w:r>
+              <w:rPr>
+                <w:rFonts w:ascii="Aptos" w:hAnsi="Aptos"/>
+              </w:rPr>
               <w:t>Normal (1.13, 0.20)</w:t>
             </w:r>
           </w:p>
@@ -509,7 +1015,15 @@
             <w:tcW w:w="2424" w:type="dxa"/>
           </w:tcPr>
           <w:p>
-            <w:r>
+            <w:pPr>
+              <w:rPr>
+                <w:rFonts w:ascii="Aptos" w:hAnsi="Aptos"/>
+              </w:rPr>
+            </w:pPr>
+            <w:r>
+              <w:rPr>
+                <w:rFonts w:ascii="Aptos" w:hAnsi="Aptos"/>
+              </w:rPr>
               <w:t>Normal (0, 0.25)</w:t>
             </w:r>
           </w:p>
@@ -519,7 +1033,15 @@
             <w:tcW w:w="2034" w:type="dxa"/>
           </w:tcPr>
           <w:p>
-            <w:r>
+            <w:pPr>
+              <w:rPr>
+                <w:rFonts w:ascii="Aptos" w:hAnsi="Aptos"/>
+              </w:rPr>
+            </w:pPr>
+            <w:r>
+              <w:rPr>
+                <w:rFonts w:ascii="Aptos" w:hAnsi="Aptos"/>
+              </w:rPr>
               <w:t>NA</w:t>
             </w:r>
           </w:p>
@@ -532,27 +1054,51 @@
         <w:tc>
           <w:tcPr>
             <w:tcW w:w="2461" w:type="dxa"/>
-          </w:tcPr>
-          <w:p>
-            <w:r>
+            <w:shd w:val="clear" w:color="auto" w:fill="A6A6A6" w:themeFill="background1" w:themeFillShade="A6"/>
+          </w:tcPr>
+          <w:p>
+            <w:pPr>
+              <w:rPr>
+                <w:rFonts w:ascii="Aptos" w:hAnsi="Aptos"/>
+              </w:rPr>
+            </w:pPr>
+            <w:r>
+              <w:rPr>
+                <w:rFonts w:ascii="Aptos" w:hAnsi="Aptos"/>
+              </w:rPr>
               <w:t>Critical thermal maximum</w:t>
             </w:r>
             <w:r>
+              <w:rPr>
+                <w:rFonts w:ascii="Aptos" w:hAnsi="Aptos"/>
+              </w:rPr>
               <w:t xml:space="preserve"> </w:t>
             </w:r>
           </w:p>
           <w:p>
-            <w:r>
+            <w:pPr>
+              <w:rPr>
+                <w:rFonts w:ascii="Aptos" w:hAnsi="Aptos"/>
+              </w:rPr>
+            </w:pPr>
+            <w:r>
+              <w:rPr>
+                <w:rFonts w:ascii="Aptos" w:hAnsi="Aptos"/>
+              </w:rPr>
               <w:t xml:space="preserve">(GLMM; </w:t>
             </w:r>
             <w:r>
               <w:rPr>
+                <w:rFonts w:ascii="Aptos" w:hAnsi="Aptos"/>
                 <w:i/>
                 <w:iCs/>
               </w:rPr>
               <w:t>brms</w:t>
             </w:r>
             <w:r>
+              <w:rPr>
+                <w:rFonts w:ascii="Aptos" w:hAnsi="Aptos"/>
+              </w:rPr>
               <w:t>)</w:t>
             </w:r>
           </w:p>
@@ -560,17 +1106,31 @@
         <w:tc>
           <w:tcPr>
             <w:tcW w:w="3775" w:type="dxa"/>
-          </w:tcPr>
-          <w:p>
-            <w:r>
-              <w:t>Developmental temperature</w:t>
-            </w:r>
-            <w:r>
-              <w:t xml:space="preserve"> *Latitude </w:t>
-            </w:r>
-          </w:p>
-          <w:p>
-            <w:r>
+            <w:shd w:val="clear" w:color="auto" w:fill="A6A6A6" w:themeFill="background1" w:themeFillShade="A6"/>
+          </w:tcPr>
+          <w:p>
+            <w:pPr>
+              <w:rPr>
+                <w:rFonts w:ascii="Aptos" w:hAnsi="Aptos"/>
+              </w:rPr>
+            </w:pPr>
+            <w:r>
+              <w:rPr>
+                <w:rFonts w:ascii="Aptos" w:hAnsi="Aptos"/>
+              </w:rPr>
+              <w:t xml:space="preserve">Developmental temperature *Latitude </w:t>
+            </w:r>
+          </w:p>
+          <w:p>
+            <w:pPr>
+              <w:rPr>
+                <w:rFonts w:ascii="Aptos" w:hAnsi="Aptos"/>
+              </w:rPr>
+            </w:pPr>
+            <w:r>
+              <w:rPr>
+                <w:rFonts w:ascii="Aptos" w:hAnsi="Aptos"/>
+              </w:rPr>
               <w:t>Mass</w:t>
             </w:r>
           </w:p>
@@ -578,24 +1138,57 @@
         <w:tc>
           <w:tcPr>
             <w:tcW w:w="2126" w:type="dxa"/>
-          </w:tcPr>
-          <w:p>
-            <w:r>
+            <w:shd w:val="clear" w:color="auto" w:fill="A6A6A6" w:themeFill="background1" w:themeFillShade="A6"/>
+          </w:tcPr>
+          <w:p>
+            <w:pPr>
+              <w:rPr>
+                <w:rFonts w:ascii="Aptos" w:hAnsi="Aptos"/>
+              </w:rPr>
+            </w:pPr>
+            <w:r>
+              <w:rPr>
+                <w:rFonts w:ascii="Aptos" w:hAnsi="Aptos"/>
+              </w:rPr>
               <w:t xml:space="preserve">Level/Tank </w:t>
             </w:r>
           </w:p>
           <w:p>
-            <w:r>
+            <w:pPr>
+              <w:rPr>
+                <w:rFonts w:ascii="Aptos" w:hAnsi="Aptos"/>
+              </w:rPr>
+            </w:pPr>
+            <w:r>
+              <w:rPr>
+                <w:rFonts w:ascii="Aptos" w:hAnsi="Aptos"/>
+              </w:rPr>
               <w:t xml:space="preserve">Population </w:t>
             </w:r>
           </w:p>
           <w:p>
-            <w:r>
+            <w:pPr>
+              <w:rPr>
+                <w:rFonts w:ascii="Aptos" w:hAnsi="Aptos"/>
+              </w:rPr>
+            </w:pPr>
+            <w:r>
+              <w:rPr>
+                <w:rFonts w:ascii="Aptos" w:hAnsi="Aptos"/>
+              </w:rPr>
               <w:t xml:space="preserve">Female </w:t>
             </w:r>
           </w:p>
           <w:p>
-            <w:r>
+            <w:pPr>
+              <w:rPr>
+                <w:rFonts w:ascii="Aptos" w:hAnsi="Aptos"/>
+              </w:rPr>
+            </w:pPr>
+            <w:r>
+              <w:rPr>
+                <w:rFonts w:ascii="Aptos" w:hAnsi="Aptos"/>
+              </w:rPr>
               <w:t>Clutch order</w:t>
             </w:r>
           </w:p>
@@ -603,9 +1196,21 @@
         <w:tc>
           <w:tcPr>
             <w:tcW w:w="1843" w:type="dxa"/>
-          </w:tcPr>
-          <w:p>
-            <w:r>
+            <w:tcBorders>
+              <w:right w:val="single" w:sz="4" w:space="0" w:color="auto"/>
+            </w:tcBorders>
+            <w:shd w:val="clear" w:color="auto" w:fill="A6A6A6" w:themeFill="background1" w:themeFillShade="A6"/>
+          </w:tcPr>
+          <w:p>
+            <w:pPr>
+              <w:rPr>
+                <w:rFonts w:ascii="Aptos" w:hAnsi="Aptos"/>
+              </w:rPr>
+            </w:pPr>
+            <w:r>
+              <w:rPr>
+                <w:rFonts w:ascii="Aptos" w:hAnsi="Aptos"/>
+              </w:rPr>
               <w:t>Gaussian(identity)</w:t>
             </w:r>
           </w:p>
@@ -613,9 +1218,21 @@
         <w:tc>
           <w:tcPr>
             <w:tcW w:w="1842" w:type="dxa"/>
-          </w:tcPr>
-          <w:p>
-            <w:r>
+            <w:tcBorders>
+              <w:left w:val="single" w:sz="4" w:space="0" w:color="auto"/>
+            </w:tcBorders>
+            <w:shd w:val="clear" w:color="auto" w:fill="A6A6A6" w:themeFill="background1" w:themeFillShade="A6"/>
+          </w:tcPr>
+          <w:p>
+            <w:pPr>
+              <w:rPr>
+                <w:rFonts w:ascii="Aptos" w:hAnsi="Aptos"/>
+              </w:rPr>
+            </w:pPr>
+            <w:r>
+              <w:rPr>
+                <w:rFonts w:ascii="Aptos" w:hAnsi="Aptos"/>
+              </w:rPr>
               <w:t>Normal (37, 0.50)</w:t>
             </w:r>
           </w:p>
@@ -623,9 +1240,18 @@
         <w:tc>
           <w:tcPr>
             <w:tcW w:w="2424" w:type="dxa"/>
-          </w:tcPr>
-          <w:p>
-            <w:r>
+            <w:shd w:val="clear" w:color="auto" w:fill="A6A6A6" w:themeFill="background1" w:themeFillShade="A6"/>
+          </w:tcPr>
+          <w:p>
+            <w:pPr>
+              <w:rPr>
+                <w:rFonts w:ascii="Aptos" w:hAnsi="Aptos"/>
+              </w:rPr>
+            </w:pPr>
+            <w:r>
+              <w:rPr>
+                <w:rFonts w:ascii="Aptos" w:hAnsi="Aptos"/>
+              </w:rPr>
               <w:t>Normal (0, 0.05)</w:t>
             </w:r>
           </w:p>
@@ -633,17 +1259,32 @@
         <w:tc>
           <w:tcPr>
             <w:tcW w:w="2034" w:type="dxa"/>
-          </w:tcPr>
-          <w:p>
-            <w:r>
+            <w:shd w:val="clear" w:color="auto" w:fill="A6A6A6" w:themeFill="background1" w:themeFillShade="A6"/>
+          </w:tcPr>
+          <w:p>
+            <w:pPr>
+              <w:rPr>
+                <w:rFonts w:ascii="Aptos" w:hAnsi="Aptos"/>
+              </w:rPr>
+            </w:pPr>
+            <w:r>
+              <w:rPr>
+                <w:rFonts w:ascii="Aptos" w:hAnsi="Aptos"/>
+              </w:rPr>
               <w:t xml:space="preserve">Student </w:t>
             </w:r>
             <w:proofErr w:type="spellStart"/>
             <w:r>
+              <w:rPr>
+                <w:rFonts w:ascii="Aptos" w:hAnsi="Aptos"/>
+              </w:rPr>
               <w:t>t</w:t>
             </w:r>
             <w:proofErr w:type="spellEnd"/>
             <w:r>
+              <w:rPr>
+                <w:rFonts w:ascii="Aptos" w:hAnsi="Aptos"/>
+              </w:rPr>
               <w:t xml:space="preserve"> (3, 0, 0.1975)</w:t>
             </w:r>
           </w:p>
@@ -656,42 +1297,73 @@
         <w:tc>
           <w:tcPr>
             <w:tcW w:w="2461" w:type="dxa"/>
-          </w:tcPr>
-          <w:p>
-            <w:r>
+            <w:tcBorders>
+              <w:bottom w:val="single" w:sz="18" w:space="0" w:color="auto"/>
+            </w:tcBorders>
+          </w:tcPr>
+          <w:p>
+            <w:pPr>
+              <w:rPr>
+                <w:rFonts w:ascii="Aptos" w:hAnsi="Aptos"/>
+              </w:rPr>
+            </w:pPr>
+            <w:r>
+              <w:rPr>
+                <w:rFonts w:ascii="Aptos" w:hAnsi="Aptos"/>
+              </w:rPr>
               <w:t>Oxygen uptake (aerobic stress)</w:t>
             </w:r>
             <w:r>
+              <w:rPr>
+                <w:rFonts w:ascii="Aptos" w:hAnsi="Aptos"/>
+              </w:rPr>
               <w:t xml:space="preserve"> </w:t>
             </w:r>
           </w:p>
           <w:p>
-            <w:r>
+            <w:pPr>
+              <w:rPr>
+                <w:rFonts w:ascii="Aptos" w:hAnsi="Aptos"/>
+              </w:rPr>
+            </w:pPr>
+            <w:r>
+              <w:rPr>
+                <w:rFonts w:ascii="Aptos" w:hAnsi="Aptos"/>
+              </w:rPr>
               <w:t xml:space="preserve">(GAM*; </w:t>
             </w:r>
             <w:r>
               <w:rPr>
+                <w:rFonts w:ascii="Aptos" w:hAnsi="Aptos"/>
                 <w:i/>
                 <w:iCs/>
               </w:rPr>
               <w:t>brms</w:t>
             </w:r>
             <w:r>
+              <w:rPr>
+                <w:rFonts w:ascii="Aptos" w:hAnsi="Aptos"/>
+              </w:rPr>
               <w:t xml:space="preserve">) </w:t>
             </w:r>
           </w:p>
           <w:p>
             <w:pPr>
               <w:rPr>
+                <w:rFonts w:ascii="Aptos" w:hAnsi="Aptos"/>
                 <w:sz w:val="20"/>
                 <w:szCs w:val="20"/>
               </w:rPr>
             </w:pPr>
             <w:r>
+              <w:rPr>
+                <w:rFonts w:ascii="Aptos" w:hAnsi="Aptos"/>
+              </w:rPr>
               <w:t>*</w:t>
             </w:r>
             <w:r>
               <w:rPr>
+                <w:rFonts w:ascii="Aptos" w:hAnsi="Aptos"/>
                 <w:sz w:val="20"/>
                 <w:szCs w:val="20"/>
               </w:rPr>
@@ -702,20 +1374,39 @@
         <w:tc>
           <w:tcPr>
             <w:tcW w:w="3775" w:type="dxa"/>
-          </w:tcPr>
-          <w:p>
-            <w:r>
-              <w:t>Developmental temperature</w:t>
-            </w:r>
-            <w:r>
-              <w:t xml:space="preserve"> *Latitude*Temperature </w:t>
-            </w:r>
-          </w:p>
-          <w:p>
-            <w:r>
+            <w:tcBorders>
+              <w:bottom w:val="single" w:sz="18" w:space="0" w:color="auto"/>
+            </w:tcBorders>
+          </w:tcPr>
+          <w:p>
+            <w:pPr>
+              <w:rPr>
+                <w:rFonts w:ascii="Aptos" w:hAnsi="Aptos"/>
+              </w:rPr>
+            </w:pPr>
+            <w:r>
+              <w:rPr>
+                <w:rFonts w:ascii="Aptos" w:hAnsi="Aptos"/>
+              </w:rPr>
+              <w:t xml:space="preserve">Developmental temperature *Latitude*Temperature </w:t>
+            </w:r>
+          </w:p>
+          <w:p>
+            <w:pPr>
+              <w:rPr>
+                <w:rFonts w:ascii="Aptos" w:hAnsi="Aptos"/>
+              </w:rPr>
+            </w:pPr>
+            <w:r>
+              <w:rPr>
+                <w:rFonts w:ascii="Aptos" w:hAnsi="Aptos"/>
+              </w:rPr>
               <w:t>M</w:t>
             </w:r>
             <w:r>
+              <w:rPr>
+                <w:rFonts w:ascii="Aptos" w:hAnsi="Aptos"/>
+              </w:rPr>
               <w:t>ass</w:t>
             </w:r>
           </w:p>
@@ -723,14 +1414,33 @@
         <w:tc>
           <w:tcPr>
             <w:tcW w:w="2126" w:type="dxa"/>
-          </w:tcPr>
-          <w:p>
-            <w:r>
+            <w:tcBorders>
+              <w:bottom w:val="single" w:sz="18" w:space="0" w:color="auto"/>
+            </w:tcBorders>
+          </w:tcPr>
+          <w:p>
+            <w:pPr>
+              <w:rPr>
+                <w:rFonts w:ascii="Aptos" w:hAnsi="Aptos"/>
+              </w:rPr>
+            </w:pPr>
+            <w:r>
+              <w:rPr>
+                <w:rFonts w:ascii="Aptos" w:hAnsi="Aptos"/>
+              </w:rPr>
               <w:t xml:space="preserve">Female </w:t>
             </w:r>
           </w:p>
           <w:p>
-            <w:r>
+            <w:pPr>
+              <w:rPr>
+                <w:rFonts w:ascii="Aptos" w:hAnsi="Aptos"/>
+              </w:rPr>
+            </w:pPr>
+            <w:r>
+              <w:rPr>
+                <w:rFonts w:ascii="Aptos" w:hAnsi="Aptos"/>
+              </w:rPr>
               <w:t>Tank</w:t>
             </w:r>
           </w:p>
@@ -738,9 +1448,21 @@
         <w:tc>
           <w:tcPr>
             <w:tcW w:w="1843" w:type="dxa"/>
-          </w:tcPr>
-          <w:p>
-            <w:r>
+            <w:tcBorders>
+              <w:bottom w:val="single" w:sz="18" w:space="0" w:color="auto"/>
+              <w:right w:val="single" w:sz="4" w:space="0" w:color="auto"/>
+            </w:tcBorders>
+          </w:tcPr>
+          <w:p>
+            <w:pPr>
+              <w:rPr>
+                <w:rFonts w:ascii="Aptos" w:hAnsi="Aptos"/>
+              </w:rPr>
+            </w:pPr>
+            <w:r>
+              <w:rPr>
+                <w:rFonts w:ascii="Aptos" w:hAnsi="Aptos"/>
+              </w:rPr>
               <w:t>Gaussian</w:t>
             </w:r>
           </w:p>
@@ -748,9 +1470,21 @@
         <w:tc>
           <w:tcPr>
             <w:tcW w:w="1842" w:type="dxa"/>
-          </w:tcPr>
-          <w:p>
-            <w:r>
+            <w:tcBorders>
+              <w:left w:val="single" w:sz="4" w:space="0" w:color="auto"/>
+              <w:bottom w:val="single" w:sz="18" w:space="0" w:color="auto"/>
+            </w:tcBorders>
+          </w:tcPr>
+          <w:p>
+            <w:pPr>
+              <w:rPr>
+                <w:rFonts w:ascii="Aptos" w:hAnsi="Aptos"/>
+              </w:rPr>
+            </w:pPr>
+            <w:r>
+              <w:rPr>
+                <w:rFonts w:ascii="Aptos" w:hAnsi="Aptos"/>
+              </w:rPr>
               <w:t>Normal (0.635, 0.20)</w:t>
             </w:r>
           </w:p>
@@ -758,9 +1492,20 @@
         <w:tc>
           <w:tcPr>
             <w:tcW w:w="2424" w:type="dxa"/>
-          </w:tcPr>
-          <w:p>
-            <w:r>
+            <w:tcBorders>
+              <w:bottom w:val="single" w:sz="18" w:space="0" w:color="auto"/>
+            </w:tcBorders>
+          </w:tcPr>
+          <w:p>
+            <w:pPr>
+              <w:rPr>
+                <w:rFonts w:ascii="Aptos" w:hAnsi="Aptos"/>
+              </w:rPr>
+            </w:pPr>
+            <w:r>
+              <w:rPr>
+                <w:rFonts w:ascii="Aptos" w:hAnsi="Aptos"/>
+              </w:rPr>
               <w:t>Normal (0, 0.20)</w:t>
             </w:r>
           </w:p>
@@ -768,24 +1513,47 @@
         <w:tc>
           <w:tcPr>
             <w:tcW w:w="2034" w:type="dxa"/>
-          </w:tcPr>
-          <w:p>
-            <w:r>
+            <w:tcBorders>
+              <w:bottom w:val="single" w:sz="18" w:space="0" w:color="auto"/>
+            </w:tcBorders>
+          </w:tcPr>
+          <w:p>
+            <w:pPr>
+              <w:rPr>
+                <w:rFonts w:ascii="Aptos" w:hAnsi="Aptos"/>
+              </w:rPr>
+            </w:pPr>
+            <w:r>
+              <w:rPr>
+                <w:rFonts w:ascii="Aptos" w:hAnsi="Aptos"/>
+              </w:rPr>
               <w:t xml:space="preserve">Student </w:t>
             </w:r>
             <w:proofErr w:type="spellStart"/>
             <w:r>
+              <w:rPr>
+                <w:rFonts w:ascii="Aptos" w:hAnsi="Aptos"/>
+              </w:rPr>
               <w:t>t</w:t>
             </w:r>
             <w:proofErr w:type="spellEnd"/>
             <w:r>
+              <w:rPr>
+                <w:rFonts w:ascii="Aptos" w:hAnsi="Aptos"/>
+              </w:rPr>
               <w:t xml:space="preserve"> (3, 0, 0.45)</w:t>
             </w:r>
           </w:p>
         </w:tc>
       </w:tr>
     </w:tbl>
-    <w:p/>
+    <w:p>
+      <w:pPr>
+        <w:rPr>
+          <w:rFonts w:ascii="Aptos" w:hAnsi="Aptos"/>
+        </w:rPr>
+      </w:pPr>
+    </w:p>
     <w:sectPr>
       <w:pgSz w:w="16838" w:h="11906" w:orient="landscape"/>
       <w:pgMar w:top="1440" w:right="1440" w:bottom="1440" w:left="1440" w:header="708" w:footer="708" w:gutter="0"/>
@@ -797,7 +1565,7 @@
 </file>
 
 <file path=word/styles.xml><?xml version="1.0" encoding="utf-8"?>
-<w:styles xmlns:mc="http://schemas.openxmlformats.org/markup-compatibility/2006" xmlns:r="http://schemas.openxmlformats.org/officeDocument/2006/relationships" xmlns:w="http://schemas.openxmlformats.org/wordprocessingml/2006/main" xmlns:w14="http://schemas.microsoft.com/office/word/2010/wordml" xmlns:w15="http://schemas.microsoft.com/office/word/2012/wordml" xmlns:w16cex="http://schemas.microsoft.com/office/word/2018/wordml/cex" xmlns:w16cid="http://schemas.microsoft.com/office/word/2016/wordml/cid" xmlns:w16="http://schemas.microsoft.com/office/word/2018/wordml" xmlns:w16sdtdh="http://schemas.microsoft.com/office/word/2020/wordml/sdtdatahash" xmlns:w16se="http://schemas.microsoft.com/office/word/2015/wordml/symex" mc:Ignorable="w14 w15 w16se w16cid w16 w16cex w16sdtdh">
+<w:styles xmlns:mc="http://schemas.openxmlformats.org/markup-compatibility/2006" xmlns:r="http://schemas.openxmlformats.org/officeDocument/2006/relationships" xmlns:w="http://schemas.openxmlformats.org/wordprocessingml/2006/main" xmlns:w14="http://schemas.microsoft.com/office/word/2010/wordml" xmlns:w15="http://schemas.microsoft.com/office/word/2012/wordml" xmlns:w16cex="http://schemas.microsoft.com/office/word/2018/wordml/cex" xmlns:w16cid="http://schemas.microsoft.com/office/word/2016/wordml/cid" xmlns:w16="http://schemas.microsoft.com/office/word/2018/wordml" xmlns:w16du="http://schemas.microsoft.com/office/word/2023/wordml/word16du" xmlns:w16sdtdh="http://schemas.microsoft.com/office/word/2020/wordml/sdtdatahash" xmlns:w16sdtfl="http://schemas.microsoft.com/office/word/2024/wordml/sdtformatlock" xmlns:w16se="http://schemas.microsoft.com/office/word/2015/wordml/symex" mc:Ignorable="w14 w15 w16se w16cid w16 w16cex w16sdtdh w16sdtfl w16du">
   <w:docDefaults>
     <w:rPrDefault>
       <w:rPr>

</xml_diff>

<commit_message>
adjusted models to include proper random effects - changes made to length, mass, condition, and Ctmax models.
</commit_message>
<xml_diff>
--- a/tables/SupplementalTable02.docx
+++ b/tables/SupplementalTable02.docx
@@ -458,20 +458,7 @@
               <w:rPr>
                 <w:rFonts w:ascii="Aptos" w:hAnsi="Aptos"/>
               </w:rPr>
-              <w:t xml:space="preserve">Level/Tank </w:t>
-            </w:r>
-          </w:p>
-          <w:p>
-            <w:pPr>
-              <w:rPr>
-                <w:rFonts w:ascii="Aptos" w:hAnsi="Aptos"/>
-              </w:rPr>
-            </w:pPr>
-            <w:r>
-              <w:rPr>
-                <w:rFonts w:ascii="Aptos" w:hAnsi="Aptos"/>
-              </w:rPr>
-              <w:t xml:space="preserve">Population </w:t>
+              <w:t xml:space="preserve">Tank </w:t>
             </w:r>
           </w:p>
           <w:p>
@@ -493,12 +480,6 @@
                 <w:rFonts w:ascii="Aptos" w:hAnsi="Aptos"/>
               </w:rPr>
             </w:pPr>
-            <w:r>
-              <w:rPr>
-                <w:rFonts w:ascii="Aptos" w:hAnsi="Aptos"/>
-              </w:rPr>
-              <w:t>Clutch order</w:t>
-            </w:r>
           </w:p>
         </w:tc>
         <w:tc>
@@ -583,21 +564,7 @@
               <w:rPr>
                 <w:rFonts w:ascii="Aptos" w:hAnsi="Aptos"/>
               </w:rPr>
-              <w:t xml:space="preserve">Student </w:t>
-            </w:r>
-            <w:proofErr w:type="spellStart"/>
-            <w:r>
-              <w:rPr>
-                <w:rFonts w:ascii="Aptos" w:hAnsi="Aptos"/>
-              </w:rPr>
-              <w:t>t</w:t>
-            </w:r>
-            <w:proofErr w:type="spellEnd"/>
-            <w:r>
-              <w:rPr>
-                <w:rFonts w:ascii="Aptos" w:hAnsi="Aptos"/>
-              </w:rPr>
-              <w:t xml:space="preserve"> (3, 0, 4.4) </w:t>
+              <w:t xml:space="preserve">Student t (3, 0, 4.4) </w:t>
             </w:r>
           </w:p>
         </w:tc>
@@ -712,7 +679,7 @@
               <w:rPr>
                 <w:rFonts w:ascii="Aptos" w:hAnsi="Aptos"/>
               </w:rPr>
-              <w:t xml:space="preserve">Level/Tank </w:t>
+              <w:t xml:space="preserve">Tank </w:t>
             </w:r>
           </w:p>
           <w:p>
@@ -734,12 +701,6 @@
                 <w:rFonts w:ascii="Aptos" w:hAnsi="Aptos"/>
               </w:rPr>
             </w:pPr>
-            <w:r>
-              <w:rPr>
-                <w:rFonts w:ascii="Aptos" w:hAnsi="Aptos"/>
-              </w:rPr>
-              <w:t>Population</w:t>
-            </w:r>
           </w:p>
         </w:tc>
         <w:tc>
@@ -938,7 +899,7 @@
               <w:rPr>
                 <w:rFonts w:ascii="Aptos" w:hAnsi="Aptos"/>
               </w:rPr>
-              <w:t xml:space="preserve">Level/Tank </w:t>
+              <w:t xml:space="preserve">Tank </w:t>
             </w:r>
           </w:p>
           <w:p>
@@ -960,12 +921,6 @@
                 <w:rFonts w:ascii="Aptos" w:hAnsi="Aptos"/>
               </w:rPr>
             </w:pPr>
-            <w:r>
-              <w:rPr>
-                <w:rFonts w:ascii="Aptos" w:hAnsi="Aptos"/>
-              </w:rPr>
-              <w:t>Population</w:t>
-            </w:r>
           </w:p>
         </w:tc>
         <w:tc>
@@ -1150,20 +1105,7 @@
               <w:rPr>
                 <w:rFonts w:ascii="Aptos" w:hAnsi="Aptos"/>
               </w:rPr>
-              <w:t xml:space="preserve">Level/Tank </w:t>
-            </w:r>
-          </w:p>
-          <w:p>
-            <w:pPr>
-              <w:rPr>
-                <w:rFonts w:ascii="Aptos" w:hAnsi="Aptos"/>
-              </w:rPr>
-            </w:pPr>
-            <w:r>
-              <w:rPr>
-                <w:rFonts w:ascii="Aptos" w:hAnsi="Aptos"/>
-              </w:rPr>
-              <w:t xml:space="preserve">Population </w:t>
+              <w:t xml:space="preserve">Tank </w:t>
             </w:r>
           </w:p>
           <w:p>
@@ -1185,12 +1127,6 @@
                 <w:rFonts w:ascii="Aptos" w:hAnsi="Aptos"/>
               </w:rPr>
             </w:pPr>
-            <w:r>
-              <w:rPr>
-                <w:rFonts w:ascii="Aptos" w:hAnsi="Aptos"/>
-              </w:rPr>
-              <w:t>Clutch order</w:t>
-            </w:r>
           </w:p>
         </w:tc>
         <w:tc>
@@ -1271,21 +1207,7 @@
               <w:rPr>
                 <w:rFonts w:ascii="Aptos" w:hAnsi="Aptos"/>
               </w:rPr>
-              <w:t xml:space="preserve">Student </w:t>
-            </w:r>
-            <w:proofErr w:type="spellStart"/>
-            <w:r>
-              <w:rPr>
-                <w:rFonts w:ascii="Aptos" w:hAnsi="Aptos"/>
-              </w:rPr>
-              <w:t>t</w:t>
-            </w:r>
-            <w:proofErr w:type="spellEnd"/>
-            <w:r>
-              <w:rPr>
-                <w:rFonts w:ascii="Aptos" w:hAnsi="Aptos"/>
-              </w:rPr>
-              <w:t xml:space="preserve"> (3, 0, 0.1975)</w:t>
+              <w:t>Student t (3, 0, 0.1975)</w:t>
             </w:r>
           </w:p>
         </w:tc>
@@ -1428,20 +1350,20 @@
               <w:rPr>
                 <w:rFonts w:ascii="Aptos" w:hAnsi="Aptos"/>
               </w:rPr>
-              <w:t xml:space="preserve">Female </w:t>
-            </w:r>
-          </w:p>
-          <w:p>
-            <w:pPr>
-              <w:rPr>
-                <w:rFonts w:ascii="Aptos" w:hAnsi="Aptos"/>
-              </w:rPr>
-            </w:pPr>
-            <w:r>
-              <w:rPr>
-                <w:rFonts w:ascii="Aptos" w:hAnsi="Aptos"/>
-              </w:rPr>
               <w:t>Tank</w:t>
+            </w:r>
+          </w:p>
+          <w:p>
+            <w:pPr>
+              <w:rPr>
+                <w:rFonts w:ascii="Aptos" w:hAnsi="Aptos"/>
+              </w:rPr>
+            </w:pPr>
+            <w:r>
+              <w:rPr>
+                <w:rFonts w:ascii="Aptos" w:hAnsi="Aptos"/>
+              </w:rPr>
+              <w:t>Female</w:t>
             </w:r>
           </w:p>
         </w:tc>
@@ -1527,21 +1449,7 @@
               <w:rPr>
                 <w:rFonts w:ascii="Aptos" w:hAnsi="Aptos"/>
               </w:rPr>
-              <w:t xml:space="preserve">Student </w:t>
-            </w:r>
-            <w:proofErr w:type="spellStart"/>
-            <w:r>
-              <w:rPr>
-                <w:rFonts w:ascii="Aptos" w:hAnsi="Aptos"/>
-              </w:rPr>
-              <w:t>t</w:t>
-            </w:r>
-            <w:proofErr w:type="spellEnd"/>
-            <w:r>
-              <w:rPr>
-                <w:rFonts w:ascii="Aptos" w:hAnsi="Aptos"/>
-              </w:rPr>
-              <w:t xml:space="preserve"> (3, 0, 0.45)</w:t>
+              <w:t>Student t (3, 0, 0.45)</w:t>
             </w:r>
           </w:p>
         </w:tc>

</xml_diff>